<commit_message>
Lab 6: send real GA4 events, capture the outgoing hits, add setup and verification
</commit_message>
<xml_diff>
--- a/docs/ECommerce_Lab_Report_Abhishek_Barali_023bscit003.docx
+++ b/docs/ECommerce_Lab_Report_Abhishek_Barali_023bscit003.docx
@@ -12187,6 +12187,29 @@
           <w:sz w:val="24"/>
           <w:szCs w:val="24"/>
         </w:rPr>
+        <w:t xml:space="preserve">The Measurement ID is read from the GA_MEASUREMENT_ID environment variable, so a real property can be used without editing the code.</w:t>
+      </w:r>
+    </w:p>
+    <w:p>
+      <w:pPr>
+        <w:pStyle w:val="ListParagraph"/>
+        <w:numPr>
+          <w:ilvl w:val="0"/>
+          <w:numId w:val="8"/>
+        </w:numPr>
+        <w:spacing w:after="90" w:line="276"/>
+      </w:pPr>
+      <w:r>
+        <w:rPr>
+          <w:rFonts w:ascii="Times New Roman" w:cs="Times New Roman" w:eastAsia="Times New Roman" w:hAnsi="Times New Roman"/>
+          <w:b w:val="false"/>
+          <w:bCs w:val="false"/>
+          <w:i w:val="false"/>
+          <w:iCs w:val="false"/>
+          <w:color w:val="000000"/>
+          <w:sz w:val="24"/>
+          <w:szCs w:val="24"/>
+        </w:rPr>
         <w:t xml:space="preserve">Enhanced measurement is left on, so page views, scrolls and outbound clicks are collected without any extra code.</w:t>
       </w:r>
     </w:p>
@@ -12210,7 +12233,7 @@
           <w:sz w:val="24"/>
           <w:szCs w:val="24"/>
         </w:rPr>
-        <w:t xml:space="preserve">The store fires the standard e-commerce events page_view, view_item, add_to_cart, add_to_wishlist, begin_checkout and purchase, each with its own parameters.</w:t>
+        <w:t xml:space="preserve">Clicking an event button hands that event to gtag on the next page load, so page_view, view_item, add_to_cart, add_to_wishlist, begin_checkout and purchase are really sent to Google Analytics with their parameters.</w:t>
       </w:r>
     </w:p>
     <w:p>
@@ -12233,7 +12256,7 @@
           <w:sz w:val="24"/>
           <w:szCs w:val="24"/>
         </w:rPr>
-        <w:t xml:space="preserve">Every fired event is also stored locally with its parameters and time, so the data being collected can be read on the page instead of only in the Google Analytics dashboard.</w:t>
+        <w:t xml:space="preserve">The page also records every request the browser makes to google-analytics.com and lists them, so the integration can be checked without opening the Google Analytics dashboard.</w:t>
       </w:r>
     </w:p>
     <w:p>
@@ -12256,7 +12279,7 @@
           <w:sz w:val="24"/>
           <w:szCs w:val="24"/>
         </w:rPr>
-        <w:t xml:space="preserve">The report parameters chosen for this store, and the GA4 report each one is read from, are listed in a table on the page.</w:t>
+        <w:t xml:space="preserve">Every fired event is stored locally with its parameters and time as well, and the report parameters chosen for this store are listed in a table on the page.</w:t>
       </w:r>
     </w:p>
     <w:p>
@@ -12357,79 +12380,79 @@
                 <w:sz w:val="17"/>
                 <w:szCs w:val="17"/>
               </w:rPr>
-              <w:t xml:space="preserve">The GA4 gtag.js snippet is installed in the page head, the standard</w:t>
-            </w:r>
-          </w:p>
-          <w:p>
-            <w:pPr>
-              <w:spacing w:after="0" w:line="216" w:before="0"/>
-            </w:pPr>
-            <w:r>
-              <w:rPr>
-                <w:rFonts w:ascii="Consolas" w:cs="Consolas" w:eastAsia="Consolas" w:hAnsi="Consolas"/>
-                <w:b w:val="false"/>
-                <w:bCs w:val="false"/>
-                <w:i w:val="false"/>
-                <w:iCs w:val="false"/>
-                <w:color w:val="000000"/>
-                <w:sz w:val="17"/>
-                <w:szCs w:val="17"/>
-              </w:rPr>
-              <w:t xml:space="preserve">e-commerce events are fired with their parameters, and the parameters that</w:t>
-            </w:r>
-          </w:p>
-          <w:p>
-            <w:pPr>
-              <w:spacing w:after="0" w:line="216" w:before="0"/>
-            </w:pPr>
-            <w:r>
-              <w:rPr>
-                <w:rFonts w:ascii="Consolas" w:cs="Consolas" w:eastAsia="Consolas" w:hAnsi="Consolas"/>
-                <w:b w:val="false"/>
-                <w:bCs w:val="false"/>
-                <w:i w:val="false"/>
-                <w:iCs w:val="false"/>
-                <w:color w:val="000000"/>
-                <w:sz w:val="17"/>
-                <w:szCs w:val="17"/>
-              </w:rPr>
-              <w:t xml:space="preserve">are read from the GA4 reports are listed on the page. Every fired event is</w:t>
-            </w:r>
-          </w:p>
-          <w:p>
-            <w:pPr>
-              <w:spacing w:after="0" w:line="216" w:before="0"/>
-            </w:pPr>
-            <w:r>
-              <w:rPr>
-                <w:rFonts w:ascii="Consolas" w:cs="Consolas" w:eastAsia="Consolas" w:hAnsi="Consolas"/>
-                <w:b w:val="false"/>
-                <w:bCs w:val="false"/>
-                <w:i w:val="false"/>
-                <w:iCs w:val="false"/>
-                <w:color w:val="000000"/>
-                <w:sz w:val="17"/>
-                <w:szCs w:val="17"/>
-              </w:rPr>
-              <w:t xml:space="preserve">also kept locally so the collected parameters can be seen without opening the</w:t>
-            </w:r>
-          </w:p>
-          <w:p>
-            <w:pPr>
-              <w:spacing w:after="0" w:line="216" w:before="0"/>
-            </w:pPr>
-            <w:r>
-              <w:rPr>
-                <w:rFonts w:ascii="Consolas" w:cs="Consolas" w:eastAsia="Consolas" w:hAnsi="Consolas"/>
-                <w:b w:val="false"/>
-                <w:bCs w:val="false"/>
-                <w:i w:val="false"/>
-                <w:iCs w:val="false"/>
-                <w:color w:val="000000"/>
-                <w:sz w:val="17"/>
-                <w:szCs w:val="17"/>
-              </w:rPr>
-              <w:t xml:space="preserve">Google Analytics dashboard.</w:t>
+              <w:t xml:space="preserve">The GA4 gtag.js snippet is installed in the page head, the standard e-commerce</w:t>
+            </w:r>
+          </w:p>
+          <w:p>
+            <w:pPr>
+              <w:spacing w:after="0" w:line="216" w:before="0"/>
+            </w:pPr>
+            <w:r>
+              <w:rPr>
+                <w:rFonts w:ascii="Consolas" w:cs="Consolas" w:eastAsia="Consolas" w:hAnsi="Consolas"/>
+                <w:b w:val="false"/>
+                <w:bCs w:val="false"/>
+                <w:i w:val="false"/>
+                <w:iCs w:val="false"/>
+                <w:color w:val="000000"/>
+                <w:sz w:val="17"/>
+                <w:szCs w:val="17"/>
+              </w:rPr>
+              <w:t xml:space="preserve">events are fired through gtag so they really are sent to Google Analytics, and</w:t>
+            </w:r>
+          </w:p>
+          <w:p>
+            <w:pPr>
+              <w:spacing w:after="0" w:line="216" w:before="0"/>
+            </w:pPr>
+            <w:r>
+              <w:rPr>
+                <w:rFonts w:ascii="Consolas" w:cs="Consolas" w:eastAsia="Consolas" w:hAnsi="Consolas"/>
+                <w:b w:val="false"/>
+                <w:bCs w:val="false"/>
+                <w:i w:val="false"/>
+                <w:iCs w:val="false"/>
+                <w:color w:val="000000"/>
+                <w:sz w:val="17"/>
+                <w:szCs w:val="17"/>
+              </w:rPr>
+              <w:t xml:space="preserve">the parameters read from the GA4 reports are listed on the page. Every hit the</w:t>
+            </w:r>
+          </w:p>
+          <w:p>
+            <w:pPr>
+              <w:spacing w:after="0" w:line="216" w:before="0"/>
+            </w:pPr>
+            <w:r>
+              <w:rPr>
+                <w:rFonts w:ascii="Consolas" w:cs="Consolas" w:eastAsia="Consolas" w:hAnsi="Consolas"/>
+                <w:b w:val="false"/>
+                <w:bCs w:val="false"/>
+                <w:i w:val="false"/>
+                <w:iCs w:val="false"/>
+                <w:color w:val="000000"/>
+                <w:sz w:val="17"/>
+                <w:szCs w:val="17"/>
+              </w:rPr>
+              <w:t xml:space="preserve">browser sends to google-analytics.com is also captured and shown on the page,</w:t>
+            </w:r>
+          </w:p>
+          <w:p>
+            <w:pPr>
+              <w:spacing w:after="0" w:line="216" w:before="0"/>
+            </w:pPr>
+            <w:r>
+              <w:rPr>
+                <w:rFonts w:ascii="Consolas" w:cs="Consolas" w:eastAsia="Consolas" w:hAnsi="Consolas"/>
+                <w:b w:val="false"/>
+                <w:bCs w:val="false"/>
+                <w:i w:val="false"/>
+                <w:iCs w:val="false"/>
+                <w:color w:val="000000"/>
+                <w:sz w:val="17"/>
+                <w:szCs w:val="17"/>
+              </w:rPr>
+              <w:t xml:space="preserve">so the integration can be checked without opening the GA dashboard.</w:t>
             </w:r>
           </w:p>
           <w:p>
@@ -12501,6 +12524,96 @@
                 <w:sz w:val="17"/>
                 <w:szCs w:val="17"/>
               </w:rPr>
+              <w:t xml:space="preserve">The Measurement ID comes from the GA_MEASUREMENT_ID environment variable, so a</w:t>
+            </w:r>
+          </w:p>
+          <w:p>
+            <w:pPr>
+              <w:spacing w:after="0" w:line="216" w:before="0"/>
+            </w:pPr>
+            <w:r>
+              <w:rPr>
+                <w:rFonts w:ascii="Consolas" w:cs="Consolas" w:eastAsia="Consolas" w:hAnsi="Consolas"/>
+                <w:b w:val="false"/>
+                <w:bCs w:val="false"/>
+                <w:i w:val="false"/>
+                <w:iCs w:val="false"/>
+                <w:color w:val="000000"/>
+                <w:sz w:val="17"/>
+                <w:szCs w:val="17"/>
+              </w:rPr>
+              <w:t xml:space="preserve">real GA4 property can be used without editing the code:</w:t>
+            </w:r>
+          </w:p>
+          <w:p>
+            <w:pPr>
+              <w:spacing w:after="0" w:line="216" w:before="0"/>
+            </w:pPr>
+            <w:r>
+              <w:rPr>
+                <w:rFonts w:ascii="Consolas" w:cs="Consolas" w:eastAsia="Consolas" w:hAnsi="Consolas"/>
+                <w:b w:val="false"/>
+                <w:bCs w:val="false"/>
+                <w:i w:val="false"/>
+                <w:iCs w:val="false"/>
+                <w:color w:val="000000"/>
+                <w:sz w:val="17"/>
+                <w:szCs w:val="17"/>
+              </w:rPr>
+              <w:t xml:space="preserve"> </w:t>
+            </w:r>
+          </w:p>
+          <w:p>
+            <w:pPr>
+              <w:spacing w:after="0" w:line="216" w:before="0"/>
+            </w:pPr>
+            <w:r>
+              <w:rPr>
+                <w:rFonts w:ascii="Consolas" w:cs="Consolas" w:eastAsia="Consolas" w:hAnsi="Consolas"/>
+                <w:b w:val="false"/>
+                <w:bCs w:val="false"/>
+                <w:i w:val="false"/>
+                <w:iCs w:val="false"/>
+                <w:color w:val="000000"/>
+                <w:sz w:val="17"/>
+                <w:szCs w:val="17"/>
+              </w:rPr>
+              <w:t xml:space="preserve">    GA_MEASUREMENT_ID=G-ABCD123456 python app.py</w:t>
+            </w:r>
+          </w:p>
+          <w:p>
+            <w:pPr>
+              <w:spacing w:after="0" w:line="216" w:before="0"/>
+            </w:pPr>
+            <w:r>
+              <w:rPr>
+                <w:rFonts w:ascii="Consolas" w:cs="Consolas" w:eastAsia="Consolas" w:hAnsi="Consolas"/>
+                <w:b w:val="false"/>
+                <w:bCs w:val="false"/>
+                <w:i w:val="false"/>
+                <w:iCs w:val="false"/>
+                <w:color w:val="000000"/>
+                <w:sz w:val="17"/>
+                <w:szCs w:val="17"/>
+              </w:rPr>
+              <w:t xml:space="preserve"> </w:t>
+            </w:r>
+          </w:p>
+          <w:p>
+            <w:pPr>
+              <w:spacing w:after="0" w:line="216" w:before="0"/>
+            </w:pPr>
+            <w:r>
+              <w:rPr>
+                <w:rFonts w:ascii="Consolas" w:cs="Consolas" w:eastAsia="Consolas" w:hAnsi="Consolas"/>
+                <w:b w:val="false"/>
+                <w:bCs w:val="false"/>
+                <w:i w:val="false"/>
+                <w:iCs w:val="false"/>
+                <w:color w:val="000000"/>
+                <w:sz w:val="17"/>
+                <w:szCs w:val="17"/>
+              </w:rPr>
               <w:t xml:space="preserve">Abhishek Barali - 023bscit003 - Section A - Batch 2023</w:t>
             </w:r>
           </w:p>
@@ -12537,6 +12650,42 @@
                 <w:sz w:val="17"/>
                 <w:szCs w:val="17"/>
               </w:rPr>
+              <w:t xml:space="preserve">import json</w:t>
+            </w:r>
+          </w:p>
+          <w:p>
+            <w:pPr>
+              <w:spacing w:after="0" w:line="216" w:before="0"/>
+            </w:pPr>
+            <w:r>
+              <w:rPr>
+                <w:rFonts w:ascii="Consolas" w:cs="Consolas" w:eastAsia="Consolas" w:hAnsi="Consolas"/>
+                <w:b w:val="false"/>
+                <w:bCs w:val="false"/>
+                <w:i w:val="false"/>
+                <w:iCs w:val="false"/>
+                <w:color w:val="000000"/>
+                <w:sz w:val="17"/>
+                <w:szCs w:val="17"/>
+              </w:rPr>
+              <w:t xml:space="preserve">import os</w:t>
+            </w:r>
+          </w:p>
+          <w:p>
+            <w:pPr>
+              <w:spacing w:after="0" w:line="216" w:before="0"/>
+            </w:pPr>
+            <w:r>
+              <w:rPr>
+                <w:rFonts w:ascii="Consolas" w:cs="Consolas" w:eastAsia="Consolas" w:hAnsi="Consolas"/>
+                <w:b w:val="false"/>
+                <w:bCs w:val="false"/>
+                <w:i w:val="false"/>
+                <w:iCs w:val="false"/>
+                <w:color w:val="000000"/>
+                <w:sz w:val="17"/>
+                <w:szCs w:val="17"/>
+              </w:rPr>
               <w:t xml:space="preserve">from datetime import datetime</w:t>
             </w:r>
           </w:p>
@@ -12717,7 +12866,7 @@
                 <w:sz w:val="17"/>
                 <w:szCs w:val="17"/>
               </w:rPr>
-              <w:t xml:space="preserve">    "measurement_id": "G-XXXXXXXXXX",     # from the GA4 web data stream</w:t>
+              <w:t xml:space="preserve">    "measurement_id": os.environ.get("GA_MEASUREMENT_ID", "G-XXXXXXXXXX"),</w:t>
             </w:r>
           </w:p>
           <w:p>
@@ -12969,7 +13118,7 @@
                 <w:sz w:val="17"/>
                 <w:szCs w:val="17"/>
               </w:rPr>
-              <w:t xml:space="preserve">    "begin_checkout": {"items": 2, "value": 6700, "currency": "NPR",</w:t>
+              <w:t xml:space="preserve">    "begin_checkout": {"item_count": 2, "value": 6700, "currency": "NPR",</w:t>
             </w:r>
           </w:p>
           <w:p>
@@ -13023,7 +13172,7 @@
                 <w:sz w:val="17"/>
                 <w:szCs w:val="17"/>
               </w:rPr>
-              <w:t xml:space="preserve">                 "shipping": 100, "currency": "NPR", "items": 2},</w:t>
+              <w:t xml:space="preserve">                 "shipping": 100, "currency": "NPR", "item_count": 2},</w:t>
             </w:r>
           </w:p>
           <w:p>
@@ -13509,6 +13658,78 @@
                 <w:sz w:val="17"/>
                 <w:szCs w:val="17"/>
               </w:rPr>
+              <w:t xml:space="preserve">    # The event named in ?send= is handed to gtag when the page loads, so the</w:t>
+            </w:r>
+          </w:p>
+          <w:p>
+            <w:pPr>
+              <w:spacing w:after="0" w:line="216" w:before="0"/>
+            </w:pPr>
+            <w:r>
+              <w:rPr>
+                <w:rFonts w:ascii="Consolas" w:cs="Consolas" w:eastAsia="Consolas" w:hAnsi="Consolas"/>
+                <w:b w:val="false"/>
+                <w:bCs w:val="false"/>
+                <w:i w:val="false"/>
+                <w:iCs w:val="false"/>
+                <w:color w:val="000000"/>
+                <w:sz w:val="17"/>
+                <w:szCs w:val="17"/>
+              </w:rPr>
+              <w:t xml:space="preserve">    # hit is really sent to Google Analytics by the browser.</w:t>
+            </w:r>
+          </w:p>
+          <w:p>
+            <w:pPr>
+              <w:spacing w:after="0" w:line="216" w:before="0"/>
+            </w:pPr>
+            <w:r>
+              <w:rPr>
+                <w:rFonts w:ascii="Consolas" w:cs="Consolas" w:eastAsia="Consolas" w:hAnsi="Consolas"/>
+                <w:b w:val="false"/>
+                <w:bCs w:val="false"/>
+                <w:i w:val="false"/>
+                <w:iCs w:val="false"/>
+                <w:color w:val="000000"/>
+                <w:sz w:val="17"/>
+                <w:szCs w:val="17"/>
+              </w:rPr>
+              <w:t xml:space="preserve">    send = request.args.get("send")</w:t>
+            </w:r>
+          </w:p>
+          <w:p>
+            <w:pPr>
+              <w:spacing w:after="0" w:line="216" w:before="0"/>
+            </w:pPr>
+            <w:r>
+              <w:rPr>
+                <w:rFonts w:ascii="Consolas" w:cs="Consolas" w:eastAsia="Consolas" w:hAnsi="Consolas"/>
+                <w:b w:val="false"/>
+                <w:bCs w:val="false"/>
+                <w:i w:val="false"/>
+                <w:iCs w:val="false"/>
+                <w:color w:val="000000"/>
+                <w:sz w:val="17"/>
+                <w:szCs w:val="17"/>
+              </w:rPr>
+              <w:t xml:space="preserve">    pending = {"name": send, "params": EVENTS[send]} if send in EVENTS else None</w:t>
+            </w:r>
+          </w:p>
+          <w:p>
+            <w:pPr>
+              <w:spacing w:after="0" w:line="216" w:before="0"/>
+            </w:pPr>
+            <w:r>
+              <w:rPr>
+                <w:rFonts w:ascii="Consolas" w:cs="Consolas" w:eastAsia="Consolas" w:hAnsi="Consolas"/>
+                <w:b w:val="false"/>
+                <w:bCs w:val="false"/>
+                <w:i w:val="false"/>
+                <w:iCs w:val="false"/>
+                <w:color w:val="000000"/>
+                <w:sz w:val="17"/>
+                <w:szCs w:val="17"/>
+              </w:rPr>
               <w:t xml:space="preserve">    return render_template("index.html", prop=PROPERTY, events=EVENTS,</w:t>
             </w:r>
           </w:p>
@@ -13545,7 +13766,61 @@
                 <w:sz w:val="17"/>
                 <w:szCs w:val="17"/>
               </w:rPr>
-              <w:t xml:space="preserve">                           counts=counts, fired=len(log))</w:t>
+              <w:t xml:space="preserve">                           counts=counts, fired=len(log), pending=pending,</w:t>
+            </w:r>
+          </w:p>
+          <w:p>
+            <w:pPr>
+              <w:spacing w:after="0" w:line="216" w:before="0"/>
+            </w:pPr>
+            <w:r>
+              <w:rPr>
+                <w:rFonts w:ascii="Consolas" w:cs="Consolas" w:eastAsia="Consolas" w:hAnsi="Consolas"/>
+                <w:b w:val="false"/>
+                <w:bCs w:val="false"/>
+                <w:i w:val="false"/>
+                <w:iCs w:val="false"/>
+                <w:color w:val="000000"/>
+                <w:sz w:val="17"/>
+                <w:szCs w:val="17"/>
+              </w:rPr>
+              <w:t xml:space="preserve">                           live=not PROPERTY["measurement_id"].startswith("G-XXXX"),</w:t>
+            </w:r>
+          </w:p>
+          <w:p>
+            <w:pPr>
+              <w:spacing w:after="0" w:line="216" w:before="0"/>
+            </w:pPr>
+            <w:r>
+              <w:rPr>
+                <w:rFonts w:ascii="Consolas" w:cs="Consolas" w:eastAsia="Consolas" w:hAnsi="Consolas"/>
+                <w:b w:val="false"/>
+                <w:bCs w:val="false"/>
+                <w:i w:val="false"/>
+                <w:iCs w:val="false"/>
+                <w:color w:val="000000"/>
+                <w:sz w:val="17"/>
+                <w:szCs w:val="17"/>
+              </w:rPr>
+              <w:t xml:space="preserve">                           pending_json=json.dumps(pending["params"]) if pending else</w:t>
+            </w:r>
+          </w:p>
+          <w:p>
+            <w:pPr>
+              <w:spacing w:after="0" w:line="216" w:before="0"/>
+            </w:pPr>
+            <w:r>
+              <w:rPr>
+                <w:rFonts w:ascii="Consolas" w:cs="Consolas" w:eastAsia="Consolas" w:hAnsi="Consolas"/>
+                <w:b w:val="false"/>
+                <w:bCs w:val="false"/>
+                <w:i w:val="false"/>
+                <w:iCs w:val="false"/>
+                <w:color w:val="000000"/>
+                <w:sz w:val="17"/>
+                <w:szCs w:val="17"/>
+              </w:rPr>
+              <w:t xml:space="preserve">                               "{}")</w:t>
             </w:r>
           </w:p>
           <w:p>
@@ -13635,61 +13910,79 @@
                 <w:sz w:val="17"/>
                 <w:szCs w:val="17"/>
               </w:rPr>
-              <w:t xml:space="preserve">    if name in EVENTS:</w:t>
-            </w:r>
-          </w:p>
-          <w:p>
-            <w:pPr>
-              <w:spacing w:after="0" w:line="216" w:before="0"/>
-            </w:pPr>
-            <w:r>
-              <w:rPr>
-                <w:rFonts w:ascii="Consolas" w:cs="Consolas" w:eastAsia="Consolas" w:hAnsi="Consolas"/>
-                <w:b w:val="false"/>
-                <w:bCs w:val="false"/>
-                <w:i w:val="false"/>
-                <w:iCs w:val="false"/>
-                <w:color w:val="000000"/>
-                <w:sz w:val="17"/>
-                <w:szCs w:val="17"/>
-              </w:rPr>
-              <w:t xml:space="preserve">        log.append({"name": name, "params": EVENTS[name],</w:t>
-            </w:r>
-          </w:p>
-          <w:p>
-            <w:pPr>
-              <w:spacing w:after="0" w:line="216" w:before="0"/>
-            </w:pPr>
-            <w:r>
-              <w:rPr>
-                <w:rFonts w:ascii="Consolas" w:cs="Consolas" w:eastAsia="Consolas" w:hAnsi="Consolas"/>
-                <w:b w:val="false"/>
-                <w:bCs w:val="false"/>
-                <w:i w:val="false"/>
-                <w:iCs w:val="false"/>
-                <w:color w:val="000000"/>
-                <w:sz w:val="17"/>
-                <w:szCs w:val="17"/>
-              </w:rPr>
-              <w:t xml:space="preserve">                    "time": datetime.now().strftime("%H:%M:%S")})</w:t>
-            </w:r>
-          </w:p>
-          <w:p>
-            <w:pPr>
-              <w:spacing w:after="0" w:line="216" w:before="0"/>
-            </w:pPr>
-            <w:r>
-              <w:rPr>
-                <w:rFonts w:ascii="Consolas" w:cs="Consolas" w:eastAsia="Consolas" w:hAnsi="Consolas"/>
-                <w:b w:val="false"/>
-                <w:bCs w:val="false"/>
-                <w:i w:val="false"/>
-                <w:iCs w:val="false"/>
-                <w:color w:val="000000"/>
-                <w:sz w:val="17"/>
-                <w:szCs w:val="17"/>
-              </w:rPr>
-              <w:t xml:space="preserve">    return redirect(url_for("home"))</w:t>
+              <w:t xml:space="preserve">    if name not in EVENTS:</w:t>
+            </w:r>
+          </w:p>
+          <w:p>
+            <w:pPr>
+              <w:spacing w:after="0" w:line="216" w:before="0"/>
+            </w:pPr>
+            <w:r>
+              <w:rPr>
+                <w:rFonts w:ascii="Consolas" w:cs="Consolas" w:eastAsia="Consolas" w:hAnsi="Consolas"/>
+                <w:b w:val="false"/>
+                <w:bCs w:val="false"/>
+                <w:i w:val="false"/>
+                <w:iCs w:val="false"/>
+                <w:color w:val="000000"/>
+                <w:sz w:val="17"/>
+                <w:szCs w:val="17"/>
+              </w:rPr>
+              <w:t xml:space="preserve">        return redirect(url_for("home"))</w:t>
+            </w:r>
+          </w:p>
+          <w:p>
+            <w:pPr>
+              <w:spacing w:after="0" w:line="216" w:before="0"/>
+            </w:pPr>
+            <w:r>
+              <w:rPr>
+                <w:rFonts w:ascii="Consolas" w:cs="Consolas" w:eastAsia="Consolas" w:hAnsi="Consolas"/>
+                <w:b w:val="false"/>
+                <w:bCs w:val="false"/>
+                <w:i w:val="false"/>
+                <w:iCs w:val="false"/>
+                <w:color w:val="000000"/>
+                <w:sz w:val="17"/>
+                <w:szCs w:val="17"/>
+              </w:rPr>
+              <w:t xml:space="preserve">    log.append({"name": name, "params": EVENTS[name],</w:t>
+            </w:r>
+          </w:p>
+          <w:p>
+            <w:pPr>
+              <w:spacing w:after="0" w:line="216" w:before="0"/>
+            </w:pPr>
+            <w:r>
+              <w:rPr>
+                <w:rFonts w:ascii="Consolas" w:cs="Consolas" w:eastAsia="Consolas" w:hAnsi="Consolas"/>
+                <w:b w:val="false"/>
+                <w:bCs w:val="false"/>
+                <w:i w:val="false"/>
+                <w:iCs w:val="false"/>
+                <w:color w:val="000000"/>
+                <w:sz w:val="17"/>
+                <w:szCs w:val="17"/>
+              </w:rPr>
+              <w:t xml:space="preserve">                "time": datetime.now().strftime("%H:%M:%S")})</w:t>
+            </w:r>
+          </w:p>
+          <w:p>
+            <w:pPr>
+              <w:spacing w:after="0" w:line="216" w:before="0"/>
+            </w:pPr>
+            <w:r>
+              <w:rPr>
+                <w:rFonts w:ascii="Consolas" w:cs="Consolas" w:eastAsia="Consolas" w:hAnsi="Consolas"/>
+                <w:b w:val="false"/>
+                <w:bCs w:val="false"/>
+                <w:i w:val="false"/>
+                <w:iCs w:val="false"/>
+                <w:color w:val="000000"/>
+                <w:sz w:val="17"/>
+                <w:szCs w:val="17"/>
+              </w:rPr>
+              <w:t xml:space="preserve">    return redirect(url_for("home", send=name))</w:t>
             </w:r>
           </w:p>
           <w:p>
@@ -13929,7 +14222,7 @@
           <w:sz w:val="24"/>
           <w:szCs w:val="24"/>
         </w:rPr>
-        <w:t xml:space="preserve">All six events were fired and each one was captured with the parameters sent, for example purchase with transaction_id ORD-023BSCIT003-01 and a value of 6800. The ten parameters chosen for the store are listed below.</w:t>
+        <w:t xml:space="preserve">All six events were fired and each one was captured with the parameters sent, for example purchase with transaction_id ORD-023BSCIT003-01 and a value of 6800. The hit panel shows the same events leaving the browser for the Google Analytics collect endpoint. The ten parameters chosen for the store are listed after the figures.</w:t>
       </w:r>
     </w:p>
     <w:p>
@@ -13940,7 +14233,7 @@
       <w:r>
         <w:drawing>
           <wp:inline distT="0" distB="0" distL="0" distR="0">
-            <wp:extent cx="5581650" cy="6257925"/>
+            <wp:extent cx="5343525" cy="6953250"/>
             <wp:effectExtent t="0" r="0" b="0" l="0"/>
             <wp:docPr id="1" name="" descr="" title=""/>
             <wp:cNvGraphicFramePr>
@@ -13965,7 +14258,7 @@
                   <pic:spPr bwMode="auto">
                     <a:xfrm>
                       <a:off x="0" y="0"/>
-                      <a:ext cx="5581650" cy="6257925"/>
+                      <a:ext cx="5343525" cy="6953250"/>
                     </a:xfrm>
                     <a:prstGeom prst="rect">
                       <a:avLst/>
@@ -13994,7 +14287,7 @@
           <w:sz w:val="21"/>
           <w:szCs w:val="21"/>
         </w:rPr>
-        <w:t xml:space="preserve">Figure 13: Lab 6. The setup carried out and the tracking snippet installed in the page head.</w:t>
+        <w:t xml:space="preserve">Figure 13: Lab 6. The setup steps and the tracking snippet installed in the page head.</w:t>
       </w:r>
     </w:p>
     <w:p>
@@ -14005,7 +14298,7 @@
       <w:r>
         <w:drawing>
           <wp:inline distT="0" distB="0" distL="0" distR="0">
-            <wp:extent cx="5257800" cy="6953250"/>
+            <wp:extent cx="4638675" cy="6953250"/>
             <wp:effectExtent t="0" r="0" b="0" l="0"/>
             <wp:docPr id="1" name="" descr="" title=""/>
             <wp:cNvGraphicFramePr>
@@ -14030,7 +14323,7 @@
                   <pic:spPr bwMode="auto">
                     <a:xfrm>
                       <a:off x="0" y="0"/>
-                      <a:ext cx="5257800" cy="6953250"/>
+                      <a:ext cx="4638675" cy="6953250"/>
                     </a:xfrm>
                     <a:prstGeom prst="rect">
                       <a:avLst/>
@@ -14060,6 +14353,1035 @@
           <w:szCs w:val="21"/>
         </w:rPr>
         <w:t xml:space="preserve">Figure 14: Lab 6 output. Six events collected with their parameters, followed by the analytics parameters determined for the store.</w:t>
+      </w:r>
+    </w:p>
+    <w:p>
+      <w:pPr>
+        <w:spacing w:after="80" w:before="60"/>
+        <w:jc w:val="center"/>
+      </w:pPr>
+      <w:r>
+        <w:drawing>
+          <wp:inline distT="0" distB="0" distL="0" distR="0">
+            <wp:extent cx="3562350" cy="6953250"/>
+            <wp:effectExtent t="0" r="0" b="0" l="0"/>
+            <wp:docPr id="1" name="" descr="" title=""/>
+            <wp:cNvGraphicFramePr>
+              <a:graphicFrameLocks xmlns:a="http://schemas.openxmlformats.org/drawingml/2006/main" noChangeAspect="1"/>
+            </wp:cNvGraphicFramePr>
+            <a:graphic xmlns:a="http://schemas.openxmlformats.org/drawingml/2006/main">
+              <a:graphicData uri="http://schemas.openxmlformats.org/drawingml/2006/picture">
+                <pic:pic xmlns:pic="http://schemas.openxmlformats.org/drawingml/2006/picture">
+                  <pic:nvPicPr>
+                    <pic:cNvPr id="0" name="" descr=""/>
+                    <pic:cNvPicPr>
+                      <a:picLocks noChangeAspect="1" noChangeArrowheads="1"/>
+                    </pic:cNvPicPr>
+                  </pic:nvPicPr>
+                  <pic:blipFill>
+                    <a:blip r:embed="rId20" cstate="none"/>
+                    <a:srcRect/>
+                    <a:stretch>
+                      <a:fillRect/>
+                    </a:stretch>
+                  </pic:blipFill>
+                  <pic:spPr bwMode="auto">
+                    <a:xfrm>
+                      <a:off x="0" y="0"/>
+                      <a:ext cx="3562350" cy="6953250"/>
+                    </a:xfrm>
+                    <a:prstGeom prst="rect">
+                      <a:avLst/>
+                    </a:prstGeom>
+                  </pic:spPr>
+                </pic:pic>
+              </a:graphicData>
+            </a:graphic>
+          </wp:inline>
+        </w:drawing>
+      </w:r>
+    </w:p>
+    <w:p>
+      <w:pPr>
+        <w:spacing w:after="280" w:before="0" w:line="276"/>
+        <w:jc w:val="center"/>
+      </w:pPr>
+      <w:r>
+        <w:rPr>
+          <w:rFonts w:ascii="Times New Roman" w:cs="Times New Roman" w:eastAsia="Times New Roman" w:hAnsi="Times New Roman"/>
+          <w:b w:val="false"/>
+          <w:bCs w:val="false"/>
+          <w:i/>
+          <w:iCs/>
+          <w:color w:val="000000"/>
+          <w:sz w:val="21"/>
+          <w:szCs w:val="21"/>
+        </w:rPr>
+        <w:t xml:space="preserve">Figure 15: Lab 6 verification. The panel lists each hit the browser sent to google-analytics.com, naming the event and the Measurement ID it was sent to.</w:t>
+      </w:r>
+    </w:p>
+    <w:p>
+      <w:pPr>
+        <w:pStyle w:val="Heading2"/>
+        <w:keepNext/>
+        <w:spacing w:before="260" w:after="140"/>
+      </w:pPr>
+      <w:r>
+        <w:rPr>
+          <w:rFonts w:ascii="Times New Roman" w:cs="Times New Roman" w:eastAsia="Times New Roman" w:hAnsi="Times New Roman"/>
+          <w:b/>
+          <w:bCs/>
+          <w:i w:val="false"/>
+          <w:iCs w:val="false"/>
+          <w:color w:val="000000"/>
+          <w:sz w:val="26"/>
+          <w:szCs w:val="26"/>
+        </w:rPr>
+        <w:t xml:space="preserve">Verification that the events reach Google Analytics</w:t>
+      </w:r>
+    </w:p>
+    <w:p>
+      <w:pPr>
+        <w:spacing w:after="160" w:before="0" w:line="276"/>
+      </w:pPr>
+      <w:r>
+        <w:rPr>
+          <w:rFonts w:ascii="Times New Roman" w:cs="Times New Roman" w:eastAsia="Times New Roman" w:hAnsi="Times New Roman"/>
+          <w:b w:val="false"/>
+          <w:bCs w:val="false"/>
+          <w:i w:val="false"/>
+          <w:iCs w:val="false"/>
+          <w:color w:val="000000"/>
+          <w:sz w:val="24"/>
+          <w:szCs w:val="24"/>
+        </w:rPr>
+        <w:t xml:space="preserve">The events are not only logged inside the program; they are handed to gtag, which sends them to Google. A script drives the page in a browser, clicks every event button and records each request made to the Google Analytics collect endpoint. Its output is below.</w:t>
+      </w:r>
+    </w:p>
+    <w:tbl>
+      <w:tblPr>
+        <w:tblW w:type="dxa" w:w="9360"/>
+        <w:tblBorders>
+          <w:top w:val="single" w:color="auto" w:sz="4"/>
+          <w:left w:val="single" w:color="auto" w:sz="4"/>
+          <w:bottom w:val="single" w:color="auto" w:sz="4"/>
+          <w:right w:val="single" w:color="auto" w:sz="4"/>
+          <w:insideH w:val="single" w:color="auto" w:sz="4"/>
+          <w:insideV w:val="single" w:color="auto" w:sz="4"/>
+        </w:tblBorders>
+      </w:tblPr>
+      <w:tblGrid>
+        <w:gridCol w:w="9360"/>
+      </w:tblGrid>
+      <w:tr>
+        <w:tc>
+          <w:tcPr>
+            <w:tcW w:type="dxa" w:w="9360"/>
+            <w:shd w:fill="F6F6F4" w:color="auto" w:val="clear"/>
+            <w:tcMar>
+              <w:top w:type="dxa" w:w="90"/>
+              <w:left w:type="dxa" w:w="150"/>
+              <w:bottom w:type="dxa" w:w="90"/>
+              <w:right w:type="dxa" w:w="120"/>
+            </w:tcMar>
+          </w:tcPr>
+          <w:p>
+            <w:pPr>
+              <w:spacing w:after="0" w:line="216" w:before="40"/>
+            </w:pPr>
+            <w:r>
+              <w:rPr>
+                <w:rFonts w:ascii="Consolas" w:cs="Consolas" w:eastAsia="Consolas" w:hAnsi="Consolas"/>
+                <w:b w:val="false"/>
+                <w:bCs w:val="false"/>
+                <w:i w:val="false"/>
+                <w:iCs w:val="false"/>
+                <w:color w:val="000000"/>
+                <w:sz w:val="17"/>
+                <w:szCs w:val="17"/>
+              </w:rPr>
+              <w:t xml:space="preserve">Verification that the Lab 6 events reach Google Analytics</w:t>
+            </w:r>
+          </w:p>
+          <w:p>
+            <w:pPr>
+              <w:spacing w:after="0" w:line="216" w:before="0"/>
+            </w:pPr>
+            <w:r>
+              <w:rPr>
+                <w:rFonts w:ascii="Consolas" w:cs="Consolas" w:eastAsia="Consolas" w:hAnsi="Consolas"/>
+                <w:b w:val="false"/>
+                <w:bCs w:val="false"/>
+                <w:i w:val="false"/>
+                <w:iCs w:val="false"/>
+                <w:color w:val="000000"/>
+                <w:sz w:val="17"/>
+                <w:szCs w:val="17"/>
+              </w:rPr>
+              <w:t xml:space="preserve">Checked on 03 Sep 2026, 02:56 AM</w:t>
+            </w:r>
+          </w:p>
+          <w:p>
+            <w:pPr>
+              <w:spacing w:after="0" w:line="216" w:before="0"/>
+            </w:pPr>
+            <w:r>
+              <w:rPr>
+                <w:rFonts w:ascii="Consolas" w:cs="Consolas" w:eastAsia="Consolas" w:hAnsi="Consolas"/>
+                <w:b w:val="false"/>
+                <w:bCs w:val="false"/>
+                <w:i w:val="false"/>
+                <w:iCs w:val="false"/>
+                <w:color w:val="000000"/>
+                <w:sz w:val="17"/>
+                <w:szCs w:val="17"/>
+              </w:rPr>
+              <w:t xml:space="preserve">Measurement ID used: G-XXXXXXXXXX</w:t>
+            </w:r>
+          </w:p>
+          <w:p>
+            <w:pPr>
+              <w:spacing w:after="0" w:line="216" w:before="0"/>
+            </w:pPr>
+            <w:r>
+              <w:rPr>
+                <w:rFonts w:ascii="Consolas" w:cs="Consolas" w:eastAsia="Consolas" w:hAnsi="Consolas"/>
+                <w:b w:val="false"/>
+                <w:bCs w:val="false"/>
+                <w:i w:val="false"/>
+                <w:iCs w:val="false"/>
+                <w:color w:val="000000"/>
+                <w:sz w:val="17"/>
+                <w:szCs w:val="17"/>
+              </w:rPr>
+              <w:t xml:space="preserve">Endpoint: https://www.google-analytics.com/g/collect</w:t>
+            </w:r>
+          </w:p>
+          <w:p>
+            <w:pPr>
+              <w:spacing w:after="0" w:line="216" w:before="0"/>
+            </w:pPr>
+            <w:r>
+              <w:rPr>
+                <w:rFonts w:ascii="Consolas" w:cs="Consolas" w:eastAsia="Consolas" w:hAnsi="Consolas"/>
+                <w:b w:val="false"/>
+                <w:bCs w:val="false"/>
+                <w:i w:val="false"/>
+                <w:iCs w:val="false"/>
+                <w:color w:val="000000"/>
+                <w:sz w:val="17"/>
+                <w:szCs w:val="17"/>
+              </w:rPr>
+              <w:t xml:space="preserve"> </w:t>
+            </w:r>
+          </w:p>
+          <w:p>
+            <w:pPr>
+              <w:spacing w:after="0" w:line="216" w:before="0"/>
+            </w:pPr>
+            <w:r>
+              <w:rPr>
+                <w:rFonts w:ascii="Consolas" w:cs="Consolas" w:eastAsia="Consolas" w:hAnsi="Consolas"/>
+                <w:b w:val="false"/>
+                <w:bCs w:val="false"/>
+                <w:i w:val="false"/>
+                <w:iCs w:val="false"/>
+                <w:color w:val="000000"/>
+                <w:sz w:val="17"/>
+                <w:szCs w:val="17"/>
+              </w:rPr>
+              <w:t xml:space="preserve"> #  EVENT SENT       MEASUREMENT ID  TRANSPORT</w:t>
+            </w:r>
+          </w:p>
+          <w:p>
+            <w:pPr>
+              <w:spacing w:after="0" w:line="216" w:before="0"/>
+            </w:pPr>
+            <w:r>
+              <w:rPr>
+                <w:rFonts w:ascii="Consolas" w:cs="Consolas" w:eastAsia="Consolas" w:hAnsi="Consolas"/>
+                <w:b w:val="false"/>
+                <w:bCs w:val="false"/>
+                <w:i w:val="false"/>
+                <w:iCs w:val="false"/>
+                <w:color w:val="000000"/>
+                <w:sz w:val="17"/>
+                <w:szCs w:val="17"/>
+              </w:rPr>
+              <w:t xml:space="preserve"> 1  page_view        G-XXXXXXXXXX    fetch</w:t>
+            </w:r>
+          </w:p>
+          <w:p>
+            <w:pPr>
+              <w:spacing w:after="0" w:line="216" w:before="0"/>
+            </w:pPr>
+            <w:r>
+              <w:rPr>
+                <w:rFonts w:ascii="Consolas" w:cs="Consolas" w:eastAsia="Consolas" w:hAnsi="Consolas"/>
+                <w:b w:val="false"/>
+                <w:bCs w:val="false"/>
+                <w:i w:val="false"/>
+                <w:iCs w:val="false"/>
+                <w:color w:val="000000"/>
+                <w:sz w:val="17"/>
+                <w:szCs w:val="17"/>
+              </w:rPr>
+              <w:t xml:space="preserve"> 2  page_view        G-XXXXXXXXXX    fetch</w:t>
+            </w:r>
+          </w:p>
+          <w:p>
+            <w:pPr>
+              <w:spacing w:after="0" w:line="216" w:before="0"/>
+            </w:pPr>
+            <w:r>
+              <w:rPr>
+                <w:rFonts w:ascii="Consolas" w:cs="Consolas" w:eastAsia="Consolas" w:hAnsi="Consolas"/>
+                <w:b w:val="false"/>
+                <w:bCs w:val="false"/>
+                <w:i w:val="false"/>
+                <w:iCs w:val="false"/>
+                <w:color w:val="000000"/>
+                <w:sz w:val="17"/>
+                <w:szCs w:val="17"/>
+              </w:rPr>
+              <w:t xml:space="preserve"> 3  page_view        G-XXXXXXXXXX    fetch</w:t>
+            </w:r>
+          </w:p>
+          <w:p>
+            <w:pPr>
+              <w:spacing w:after="0" w:line="216" w:before="0"/>
+            </w:pPr>
+            <w:r>
+              <w:rPr>
+                <w:rFonts w:ascii="Consolas" w:cs="Consolas" w:eastAsia="Consolas" w:hAnsi="Consolas"/>
+                <w:b w:val="false"/>
+                <w:bCs w:val="false"/>
+                <w:i w:val="false"/>
+                <w:iCs w:val="false"/>
+                <w:color w:val="000000"/>
+                <w:sz w:val="17"/>
+                <w:szCs w:val="17"/>
+              </w:rPr>
+              <w:t xml:space="preserve"> 4  user_engagement  G-XXXXXXXXXX    fetch</w:t>
+            </w:r>
+          </w:p>
+          <w:p>
+            <w:pPr>
+              <w:spacing w:after="0" w:line="216" w:before="0"/>
+            </w:pPr>
+            <w:r>
+              <w:rPr>
+                <w:rFonts w:ascii="Consolas" w:cs="Consolas" w:eastAsia="Consolas" w:hAnsi="Consolas"/>
+                <w:b w:val="false"/>
+                <w:bCs w:val="false"/>
+                <w:i w:val="false"/>
+                <w:iCs w:val="false"/>
+                <w:color w:val="000000"/>
+                <w:sz w:val="17"/>
+                <w:szCs w:val="17"/>
+              </w:rPr>
+              <w:t xml:space="preserve"> 5  page_view        G-XXXXXXXXXX    fetch</w:t>
+            </w:r>
+          </w:p>
+          <w:p>
+            <w:pPr>
+              <w:spacing w:after="0" w:line="216" w:before="0"/>
+            </w:pPr>
+            <w:r>
+              <w:rPr>
+                <w:rFonts w:ascii="Consolas" w:cs="Consolas" w:eastAsia="Consolas" w:hAnsi="Consolas"/>
+                <w:b w:val="false"/>
+                <w:bCs w:val="false"/>
+                <w:i w:val="false"/>
+                <w:iCs w:val="false"/>
+                <w:color w:val="000000"/>
+                <w:sz w:val="17"/>
+                <w:szCs w:val="17"/>
+              </w:rPr>
+              <w:t xml:space="preserve"> 6  view_item        G-XXXXXXXXXX    fetch</w:t>
+            </w:r>
+          </w:p>
+          <w:p>
+            <w:pPr>
+              <w:spacing w:after="0" w:line="216" w:before="0"/>
+            </w:pPr>
+            <w:r>
+              <w:rPr>
+                <w:rFonts w:ascii="Consolas" w:cs="Consolas" w:eastAsia="Consolas" w:hAnsi="Consolas"/>
+                <w:b w:val="false"/>
+                <w:bCs w:val="false"/>
+                <w:i w:val="false"/>
+                <w:iCs w:val="false"/>
+                <w:color w:val="000000"/>
+                <w:sz w:val="17"/>
+                <w:szCs w:val="17"/>
+              </w:rPr>
+              <w:t xml:space="preserve"> 7  user_engagement  G-XXXXXXXXXX    fetch</w:t>
+            </w:r>
+          </w:p>
+          <w:p>
+            <w:pPr>
+              <w:spacing w:after="0" w:line="216" w:before="0"/>
+            </w:pPr>
+            <w:r>
+              <w:rPr>
+                <w:rFonts w:ascii="Consolas" w:cs="Consolas" w:eastAsia="Consolas" w:hAnsi="Consolas"/>
+                <w:b w:val="false"/>
+                <w:bCs w:val="false"/>
+                <w:i w:val="false"/>
+                <w:iCs w:val="false"/>
+                <w:color w:val="000000"/>
+                <w:sz w:val="17"/>
+                <w:szCs w:val="17"/>
+              </w:rPr>
+              <w:t xml:space="preserve"> 8  page_view        G-XXXXXXXXXX    fetch</w:t>
+            </w:r>
+          </w:p>
+          <w:p>
+            <w:pPr>
+              <w:spacing w:after="0" w:line="216" w:before="0"/>
+            </w:pPr>
+            <w:r>
+              <w:rPr>
+                <w:rFonts w:ascii="Consolas" w:cs="Consolas" w:eastAsia="Consolas" w:hAnsi="Consolas"/>
+                <w:b w:val="false"/>
+                <w:bCs w:val="false"/>
+                <w:i w:val="false"/>
+                <w:iCs w:val="false"/>
+                <w:color w:val="000000"/>
+                <w:sz w:val="17"/>
+                <w:szCs w:val="17"/>
+              </w:rPr>
+              <w:t xml:space="preserve"> 9  add_to_cart      G-XXXXXXXXXX    fetch</w:t>
+            </w:r>
+          </w:p>
+          <w:p>
+            <w:pPr>
+              <w:spacing w:after="0" w:line="216" w:before="0"/>
+            </w:pPr>
+            <w:r>
+              <w:rPr>
+                <w:rFonts w:ascii="Consolas" w:cs="Consolas" w:eastAsia="Consolas" w:hAnsi="Consolas"/>
+                <w:b w:val="false"/>
+                <w:bCs w:val="false"/>
+                <w:i w:val="false"/>
+                <w:iCs w:val="false"/>
+                <w:color w:val="000000"/>
+                <w:sz w:val="17"/>
+                <w:szCs w:val="17"/>
+              </w:rPr>
+              <w:t xml:space="preserve">10  user_engagement  G-XXXXXXXXXX    fetch</w:t>
+            </w:r>
+          </w:p>
+          <w:p>
+            <w:pPr>
+              <w:spacing w:after="0" w:line="216" w:before="0"/>
+            </w:pPr>
+            <w:r>
+              <w:rPr>
+                <w:rFonts w:ascii="Consolas" w:cs="Consolas" w:eastAsia="Consolas" w:hAnsi="Consolas"/>
+                <w:b w:val="false"/>
+                <w:bCs w:val="false"/>
+                <w:i w:val="false"/>
+                <w:iCs w:val="false"/>
+                <w:color w:val="000000"/>
+                <w:sz w:val="17"/>
+                <w:szCs w:val="17"/>
+              </w:rPr>
+              <w:t xml:space="preserve">11  page_view        G-XXXXXXXXXX    fetch</w:t>
+            </w:r>
+          </w:p>
+          <w:p>
+            <w:pPr>
+              <w:spacing w:after="0" w:line="216" w:before="0"/>
+            </w:pPr>
+            <w:r>
+              <w:rPr>
+                <w:rFonts w:ascii="Consolas" w:cs="Consolas" w:eastAsia="Consolas" w:hAnsi="Consolas"/>
+                <w:b w:val="false"/>
+                <w:bCs w:val="false"/>
+                <w:i w:val="false"/>
+                <w:iCs w:val="false"/>
+                <w:color w:val="000000"/>
+                <w:sz w:val="17"/>
+                <w:szCs w:val="17"/>
+              </w:rPr>
+              <w:t xml:space="preserve">12  add_to_wishlist  G-XXXXXXXXXX    fetch</w:t>
+            </w:r>
+          </w:p>
+          <w:p>
+            <w:pPr>
+              <w:spacing w:after="0" w:line="216" w:before="0"/>
+            </w:pPr>
+            <w:r>
+              <w:rPr>
+                <w:rFonts w:ascii="Consolas" w:cs="Consolas" w:eastAsia="Consolas" w:hAnsi="Consolas"/>
+                <w:b w:val="false"/>
+                <w:bCs w:val="false"/>
+                <w:i w:val="false"/>
+                <w:iCs w:val="false"/>
+                <w:color w:val="000000"/>
+                <w:sz w:val="17"/>
+                <w:szCs w:val="17"/>
+              </w:rPr>
+              <w:t xml:space="preserve">13  user_engagement  G-XXXXXXXXXX    fetch</w:t>
+            </w:r>
+          </w:p>
+          <w:p>
+            <w:pPr>
+              <w:spacing w:after="0" w:line="216" w:before="0"/>
+            </w:pPr>
+            <w:r>
+              <w:rPr>
+                <w:rFonts w:ascii="Consolas" w:cs="Consolas" w:eastAsia="Consolas" w:hAnsi="Consolas"/>
+                <w:b w:val="false"/>
+                <w:bCs w:val="false"/>
+                <w:i w:val="false"/>
+                <w:iCs w:val="false"/>
+                <w:color w:val="000000"/>
+                <w:sz w:val="17"/>
+                <w:szCs w:val="17"/>
+              </w:rPr>
+              <w:t xml:space="preserve">14  page_view        G-XXXXXXXXXX    fetch</w:t>
+            </w:r>
+          </w:p>
+          <w:p>
+            <w:pPr>
+              <w:spacing w:after="0" w:line="216" w:before="0"/>
+            </w:pPr>
+            <w:r>
+              <w:rPr>
+                <w:rFonts w:ascii="Consolas" w:cs="Consolas" w:eastAsia="Consolas" w:hAnsi="Consolas"/>
+                <w:b w:val="false"/>
+                <w:bCs w:val="false"/>
+                <w:i w:val="false"/>
+                <w:iCs w:val="false"/>
+                <w:color w:val="000000"/>
+                <w:sz w:val="17"/>
+                <w:szCs w:val="17"/>
+              </w:rPr>
+              <w:t xml:space="preserve">15  begin_checkout   G-XXXXXXXXXX    fetch</w:t>
+            </w:r>
+          </w:p>
+          <w:p>
+            <w:pPr>
+              <w:spacing w:after="0" w:line="216" w:before="0"/>
+            </w:pPr>
+            <w:r>
+              <w:rPr>
+                <w:rFonts w:ascii="Consolas" w:cs="Consolas" w:eastAsia="Consolas" w:hAnsi="Consolas"/>
+                <w:b w:val="false"/>
+                <w:bCs w:val="false"/>
+                <w:i w:val="false"/>
+                <w:iCs w:val="false"/>
+                <w:color w:val="000000"/>
+                <w:sz w:val="17"/>
+                <w:szCs w:val="17"/>
+              </w:rPr>
+              <w:t xml:space="preserve">16  user_engagement  G-XXXXXXXXXX    fetch</w:t>
+            </w:r>
+          </w:p>
+          <w:p>
+            <w:pPr>
+              <w:spacing w:after="0" w:line="216" w:before="0"/>
+            </w:pPr>
+            <w:r>
+              <w:rPr>
+                <w:rFonts w:ascii="Consolas" w:cs="Consolas" w:eastAsia="Consolas" w:hAnsi="Consolas"/>
+                <w:b w:val="false"/>
+                <w:bCs w:val="false"/>
+                <w:i w:val="false"/>
+                <w:iCs w:val="false"/>
+                <w:color w:val="000000"/>
+                <w:sz w:val="17"/>
+                <w:szCs w:val="17"/>
+              </w:rPr>
+              <w:t xml:space="preserve">17  page_view        G-XXXXXXXXXX    fetch</w:t>
+            </w:r>
+          </w:p>
+          <w:p>
+            <w:pPr>
+              <w:spacing w:after="0" w:line="216" w:before="0"/>
+            </w:pPr>
+            <w:r>
+              <w:rPr>
+                <w:rFonts w:ascii="Consolas" w:cs="Consolas" w:eastAsia="Consolas" w:hAnsi="Consolas"/>
+                <w:b w:val="false"/>
+                <w:bCs w:val="false"/>
+                <w:i w:val="false"/>
+                <w:iCs w:val="false"/>
+                <w:color w:val="000000"/>
+                <w:sz w:val="17"/>
+                <w:szCs w:val="17"/>
+              </w:rPr>
+              <w:t xml:space="preserve">18  purchase         G-XXXXXXXXXX    fetch</w:t>
+            </w:r>
+          </w:p>
+          <w:p>
+            <w:pPr>
+              <w:spacing w:after="0" w:line="216" w:before="0"/>
+            </w:pPr>
+            <w:r>
+              <w:rPr>
+                <w:rFonts w:ascii="Consolas" w:cs="Consolas" w:eastAsia="Consolas" w:hAnsi="Consolas"/>
+                <w:b w:val="false"/>
+                <w:bCs w:val="false"/>
+                <w:i w:val="false"/>
+                <w:iCs w:val="false"/>
+                <w:color w:val="000000"/>
+                <w:sz w:val="17"/>
+                <w:szCs w:val="17"/>
+              </w:rPr>
+              <w:t xml:space="preserve">19  user_engagement  G-XXXXXXXXXX    fetch</w:t>
+            </w:r>
+          </w:p>
+          <w:p>
+            <w:pPr>
+              <w:spacing w:after="0" w:line="216" w:before="0"/>
+            </w:pPr>
+            <w:r>
+              <w:rPr>
+                <w:rFonts w:ascii="Consolas" w:cs="Consolas" w:eastAsia="Consolas" w:hAnsi="Consolas"/>
+                <w:b w:val="false"/>
+                <w:bCs w:val="false"/>
+                <w:i w:val="false"/>
+                <w:iCs w:val="false"/>
+                <w:color w:val="000000"/>
+                <w:sz w:val="17"/>
+                <w:szCs w:val="17"/>
+              </w:rPr>
+              <w:t xml:space="preserve"> </w:t>
+            </w:r>
+          </w:p>
+          <w:p>
+            <w:pPr>
+              <w:spacing w:after="0" w:line="216" w:before="0"/>
+            </w:pPr>
+            <w:r>
+              <w:rPr>
+                <w:rFonts w:ascii="Consolas" w:cs="Consolas" w:eastAsia="Consolas" w:hAnsi="Consolas"/>
+                <w:b w:val="false"/>
+                <w:bCs w:val="false"/>
+                <w:i w:val="false"/>
+                <w:iCs w:val="false"/>
+                <w:color w:val="000000"/>
+                <w:sz w:val="17"/>
+                <w:szCs w:val="17"/>
+              </w:rPr>
+              <w:t xml:space="preserve">19 hit(s) left the browser for the collect endpoint.</w:t>
+            </w:r>
+          </w:p>
+          <w:p>
+            <w:pPr>
+              <w:spacing w:after="0" w:line="216" w:before="0"/>
+            </w:pPr>
+            <w:r>
+              <w:rPr>
+                <w:rFonts w:ascii="Consolas" w:cs="Consolas" w:eastAsia="Consolas" w:hAnsi="Consolas"/>
+                <w:b w:val="false"/>
+                <w:bCs w:val="false"/>
+                <w:i w:val="false"/>
+                <w:iCs w:val="false"/>
+                <w:color w:val="000000"/>
+                <w:sz w:val="17"/>
+                <w:szCs w:val="17"/>
+              </w:rPr>
+              <w:t xml:space="preserve">1 response(s) were observed in this run, 1 of them HTTP 204, which is how Google</w:t>
+            </w:r>
+          </w:p>
+          <w:p>
+            <w:pPr>
+              <w:spacing w:after="0" w:line="216" w:before="0"/>
+            </w:pPr>
+            <w:r>
+              <w:rPr>
+                <w:rFonts w:ascii="Consolas" w:cs="Consolas" w:eastAsia="Consolas" w:hAnsi="Consolas"/>
+                <w:b w:val="false"/>
+                <w:bCs w:val="false"/>
+                <w:i w:val="false"/>
+                <w:iCs w:val="false"/>
+                <w:color w:val="000000"/>
+                <w:sz w:val="17"/>
+                <w:szCs w:val="17"/>
+              </w:rPr>
+              <w:t xml:space="preserve">    acknowledges a hit it has received.</w:t>
+            </w:r>
+          </w:p>
+          <w:p>
+            <w:pPr>
+              <w:spacing w:after="0" w:line="216" w:before="0"/>
+            </w:pPr>
+            <w:r>
+              <w:rPr>
+                <w:rFonts w:ascii="Consolas" w:cs="Consolas" w:eastAsia="Consolas" w:hAnsi="Consolas"/>
+                <w:b w:val="false"/>
+                <w:bCs w:val="false"/>
+                <w:i w:val="false"/>
+                <w:iCs w:val="false"/>
+                <w:color w:val="000000"/>
+                <w:sz w:val="17"/>
+                <w:szCs w:val="17"/>
+              </w:rPr>
+              <w:t xml:space="preserve">Hits sent while the page is navigating away are dispatched with keepalive,</w:t>
+            </w:r>
+          </w:p>
+          <w:p>
+            <w:pPr>
+              <w:spacing w:after="0" w:line="216" w:before="0"/>
+            </w:pPr>
+            <w:r>
+              <w:rPr>
+                <w:rFonts w:ascii="Consolas" w:cs="Consolas" w:eastAsia="Consolas" w:hAnsi="Consolas"/>
+                <w:b w:val="false"/>
+                <w:bCs w:val="false"/>
+                <w:i w:val="false"/>
+                <w:iCs w:val="false"/>
+                <w:color w:val="000000"/>
+                <w:sz w:val="17"/>
+                <w:szCs w:val="17"/>
+              </w:rPr>
+              <w:t xml:space="preserve">so their response is not always visible to the driving script; the request</w:t>
+            </w:r>
+          </w:p>
+          <w:p>
+            <w:pPr>
+              <w:spacing w:after="0" w:line="216" w:before="0"/>
+            </w:pPr>
+            <w:r>
+              <w:rPr>
+                <w:rFonts w:ascii="Consolas" w:cs="Consolas" w:eastAsia="Consolas" w:hAnsi="Consolas"/>
+                <w:b w:val="false"/>
+                <w:bCs w:val="false"/>
+                <w:i w:val="false"/>
+                <w:iCs w:val="false"/>
+                <w:color w:val="000000"/>
+                <w:sz w:val="17"/>
+                <w:szCs w:val="17"/>
+              </w:rPr>
+              <w:t xml:space="preserve">itself is recorded in the browser as it is sent.</w:t>
+            </w:r>
+          </w:p>
+          <w:p>
+            <w:pPr>
+              <w:spacing w:after="0" w:line="216" w:before="0"/>
+            </w:pPr>
+            <w:r>
+              <w:rPr>
+                <w:rFonts w:ascii="Consolas" w:cs="Consolas" w:eastAsia="Consolas" w:hAnsi="Consolas"/>
+                <w:b w:val="false"/>
+                <w:bCs w:val="false"/>
+                <w:i w:val="false"/>
+                <w:iCs w:val="false"/>
+                <w:color w:val="000000"/>
+                <w:sz w:val="17"/>
+                <w:szCs w:val="17"/>
+              </w:rPr>
+              <w:t xml:space="preserve"> </w:t>
+            </w:r>
+          </w:p>
+          <w:p>
+            <w:pPr>
+              <w:spacing w:after="0" w:line="216" w:before="0"/>
+            </w:pPr>
+            <w:r>
+              <w:rPr>
+                <w:rFonts w:ascii="Consolas" w:cs="Consolas" w:eastAsia="Consolas" w:hAnsi="Consolas"/>
+                <w:b w:val="false"/>
+                <w:bCs w:val="false"/>
+                <w:i w:val="false"/>
+                <w:iCs w:val="false"/>
+                <w:color w:val="000000"/>
+                <w:sz w:val="17"/>
+                <w:szCs w:val="17"/>
+              </w:rPr>
+              <w:t xml:space="preserve">G-XXXXXXXXXX is a placeholder, so Google accepts the hits and drops</w:t>
+            </w:r>
+          </w:p>
+          <w:p>
+            <w:pPr>
+              <w:spacing w:after="0" w:line="216" w:before="0"/>
+            </w:pPr>
+            <w:r>
+              <w:rPr>
+                <w:rFonts w:ascii="Consolas" w:cs="Consolas" w:eastAsia="Consolas" w:hAnsi="Consolas"/>
+                <w:b w:val="false"/>
+                <w:bCs w:val="false"/>
+                <w:i w:val="false"/>
+                <w:iCs w:val="false"/>
+                <w:color w:val="000000"/>
+                <w:sz w:val="17"/>
+                <w:szCs w:val="17"/>
+              </w:rPr>
+              <w:t xml:space="preserve">them: no property owns that ID. The snippet, the endpoint, the event names</w:t>
+            </w:r>
+          </w:p>
+          <w:p>
+            <w:pPr>
+              <w:spacing w:after="0" w:line="216" w:before="0"/>
+            </w:pPr>
+            <w:r>
+              <w:rPr>
+                <w:rFonts w:ascii="Consolas" w:cs="Consolas" w:eastAsia="Consolas" w:hAnsi="Consolas"/>
+                <w:b w:val="false"/>
+                <w:bCs w:val="false"/>
+                <w:i w:val="false"/>
+                <w:iCs w:val="false"/>
+                <w:color w:val="000000"/>
+                <w:sz w:val="17"/>
+                <w:szCs w:val="17"/>
+              </w:rPr>
+              <w:t xml:space="preserve">and the parameters are all real. To point the same events at a live</w:t>
+            </w:r>
+          </w:p>
+          <w:p>
+            <w:pPr>
+              <w:spacing w:after="0" w:line="216" w:before="0"/>
+            </w:pPr>
+            <w:r>
+              <w:rPr>
+                <w:rFonts w:ascii="Consolas" w:cs="Consolas" w:eastAsia="Consolas" w:hAnsi="Consolas"/>
+                <w:b w:val="false"/>
+                <w:bCs w:val="false"/>
+                <w:i w:val="false"/>
+                <w:iCs w:val="false"/>
+                <w:color w:val="000000"/>
+                <w:sz w:val="17"/>
+                <w:szCs w:val="17"/>
+              </w:rPr>
+              <w:t xml:space="preserve">property, start the program with its ID and nothing else changes:</w:t>
+            </w:r>
+          </w:p>
+          <w:p>
+            <w:pPr>
+              <w:spacing w:after="0" w:line="216" w:before="0"/>
+            </w:pPr>
+            <w:r>
+              <w:rPr>
+                <w:rFonts w:ascii="Consolas" w:cs="Consolas" w:eastAsia="Consolas" w:hAnsi="Consolas"/>
+                <w:b w:val="false"/>
+                <w:bCs w:val="false"/>
+                <w:i w:val="false"/>
+                <w:iCs w:val="false"/>
+                <w:color w:val="000000"/>
+                <w:sz w:val="17"/>
+                <w:szCs w:val="17"/>
+              </w:rPr>
+              <w:t xml:space="preserve"> </w:t>
+            </w:r>
+          </w:p>
+          <w:p>
+            <w:pPr>
+              <w:spacing w:after="0" w:line="216" w:before="0"/>
+            </w:pPr>
+            <w:r>
+              <w:rPr>
+                <w:rFonts w:ascii="Consolas" w:cs="Consolas" w:eastAsia="Consolas" w:hAnsi="Consolas"/>
+                <w:b w:val="false"/>
+                <w:bCs w:val="false"/>
+                <w:i w:val="false"/>
+                <w:iCs w:val="false"/>
+                <w:color w:val="000000"/>
+                <w:sz w:val="17"/>
+                <w:szCs w:val="17"/>
+              </w:rPr>
+              <w:t xml:space="preserve">    GA_MEASUREMENT_ID=G-ABCD123456 python app.py</w:t>
+            </w:r>
+          </w:p>
+        </w:tc>
+      </w:tr>
+    </w:tbl>
+    <w:p>
+      <w:pPr>
+        <w:spacing w:after="240" w:before="0" w:line="276"/>
+        <w:jc w:val="center"/>
+      </w:pPr>
+      <w:r>
+        <w:rPr>
+          <w:rFonts w:ascii="Times New Roman" w:cs="Times New Roman" w:eastAsia="Times New Roman" w:hAnsi="Times New Roman"/>
+          <w:b w:val="false"/>
+          <w:bCs w:val="false"/>
+          <w:i/>
+          <w:iCs/>
+          <w:color w:val="000000"/>
+          <w:sz w:val="21"/>
+          <w:szCs w:val="21"/>
+        </w:rPr>
+        <w:t xml:space="preserve">Output of tools/verify_analytics.py</w:t>
+      </w:r>
+    </w:p>
+    <w:p>
+      <w:pPr>
+        <w:spacing w:after="160" w:before="0" w:line="276"/>
+      </w:pPr>
+      <w:r>
+        <w:rPr>
+          <w:rFonts w:ascii="Times New Roman" w:cs="Times New Roman" w:eastAsia="Times New Roman" w:hAnsi="Times New Roman"/>
+          <w:b w:val="false"/>
+          <w:bCs w:val="false"/>
+          <w:i w:val="false"/>
+          <w:iCs w:val="false"/>
+          <w:color w:val="000000"/>
+          <w:sz w:val="24"/>
+          <w:szCs w:val="24"/>
+        </w:rPr>
+        <w:t xml:space="preserve">The Measurement ID in the code is a placeholder, so Google accepts these hits and drops them: no property owns that ID. Creating a GA4 property needs the account owner to sign in to Google, which is the one step that cannot be automated. Once the property exists, running the program with its ID sends the same events to it, and they appear in Reports &gt; Realtime. No code changes:</w:t>
+      </w:r>
+    </w:p>
+    <w:tbl>
+      <w:tblPr>
+        <w:tblW w:type="dxa" w:w="9360"/>
+        <w:tblBorders>
+          <w:top w:val="single" w:color="auto" w:sz="4"/>
+          <w:left w:val="single" w:color="auto" w:sz="4"/>
+          <w:bottom w:val="single" w:color="auto" w:sz="4"/>
+          <w:right w:val="single" w:color="auto" w:sz="4"/>
+          <w:insideH w:val="single" w:color="auto" w:sz="4"/>
+          <w:insideV w:val="single" w:color="auto" w:sz="4"/>
+        </w:tblBorders>
+      </w:tblPr>
+      <w:tblGrid>
+        <w:gridCol w:w="9360"/>
+      </w:tblGrid>
+      <w:tr>
+        <w:tc>
+          <w:tcPr>
+            <w:tcW w:type="dxa" w:w="9360"/>
+            <w:shd w:fill="F6F6F4" w:color="auto" w:val="clear"/>
+            <w:tcMar>
+              <w:top w:type="dxa" w:w="90"/>
+              <w:left w:type="dxa" w:w="150"/>
+              <w:bottom w:type="dxa" w:w="90"/>
+              <w:right w:type="dxa" w:w="120"/>
+            </w:tcMar>
+          </w:tcPr>
+          <w:p>
+            <w:pPr>
+              <w:spacing w:after="0" w:line="216" w:before="40"/>
+            </w:pPr>
+            <w:r>
+              <w:rPr>
+                <w:rFonts w:ascii="Consolas" w:cs="Consolas" w:eastAsia="Consolas" w:hAnsi="Consolas"/>
+                <w:b w:val="false"/>
+                <w:bCs w:val="false"/>
+                <w:i w:val="false"/>
+                <w:iCs w:val="false"/>
+                <w:color w:val="000000"/>
+                <w:sz w:val="17"/>
+                <w:szCs w:val="17"/>
+              </w:rPr>
+              <w:t xml:space="preserve">cd lab6_analytics</w:t>
+            </w:r>
+          </w:p>
+          <w:p>
+            <w:pPr>
+              <w:spacing w:after="0" w:line="216" w:before="0"/>
+            </w:pPr>
+            <w:r>
+              <w:rPr>
+                <w:rFonts w:ascii="Consolas" w:cs="Consolas" w:eastAsia="Consolas" w:hAnsi="Consolas"/>
+                <w:b w:val="false"/>
+                <w:bCs w:val="false"/>
+                <w:i w:val="false"/>
+                <w:iCs w:val="false"/>
+                <w:color w:val="000000"/>
+                <w:sz w:val="17"/>
+                <w:szCs w:val="17"/>
+              </w:rPr>
+              <w:t xml:space="preserve">GA_MEASUREMENT_ID=G-ABCD123456 ../.venv/bin/python app.py</w:t>
+            </w:r>
+          </w:p>
+          <w:p>
+            <w:pPr>
+              <w:spacing w:after="0" w:line="216" w:before="0"/>
+            </w:pPr>
+            <w:r>
+              <w:rPr>
+                <w:rFonts w:ascii="Consolas" w:cs="Consolas" w:eastAsia="Consolas" w:hAnsi="Consolas"/>
+                <w:b w:val="false"/>
+                <w:bCs w:val="false"/>
+                <w:i w:val="false"/>
+                <w:iCs w:val="false"/>
+                <w:color w:val="000000"/>
+                <w:sz w:val="17"/>
+                <w:szCs w:val="17"/>
+              </w:rPr>
+              <w:t xml:space="preserve"> </w:t>
+            </w:r>
+          </w:p>
+          <w:p>
+            <w:pPr>
+              <w:spacing w:after="0" w:line="216" w:before="0"/>
+            </w:pPr>
+            <w:r>
+              <w:rPr>
+                <w:rFonts w:ascii="Consolas" w:cs="Consolas" w:eastAsia="Consolas" w:hAnsi="Consolas"/>
+                <w:b w:val="false"/>
+                <w:bCs w:val="false"/>
+                <w:i w:val="false"/>
+                <w:iCs w:val="false"/>
+                <w:color w:val="000000"/>
+                <w:sz w:val="17"/>
+                <w:szCs w:val="17"/>
+              </w:rPr>
+              <w:t xml:space="preserve"># then open http://127.0.0.1:5006 and click the event buttons,</w:t>
+            </w:r>
+          </w:p>
+          <w:p>
+            <w:pPr>
+              <w:spacing w:after="0" w:line="216" w:before="0"/>
+            </w:pPr>
+            <w:r>
+              <w:rPr>
+                <w:rFonts w:ascii="Consolas" w:cs="Consolas" w:eastAsia="Consolas" w:hAnsi="Consolas"/>
+                <w:b w:val="false"/>
+                <w:bCs w:val="false"/>
+                <w:i w:val="false"/>
+                <w:iCs w:val="false"/>
+                <w:color w:val="000000"/>
+                <w:sz w:val="17"/>
+                <w:szCs w:val="17"/>
+              </w:rPr>
+              <w:t xml:space="preserve"># and watch them arrive in Google Analytics under Reports &gt; Realtime</w:t>
+            </w:r>
+          </w:p>
+        </w:tc>
+      </w:tr>
+    </w:tbl>
+    <w:p>
+      <w:pPr>
+        <w:spacing w:after="240" w:before="0" w:line="276"/>
+        <w:jc w:val="center"/>
+      </w:pPr>
+      <w:r>
+        <w:rPr>
+          <w:rFonts w:ascii="Times New Roman" w:cs="Times New Roman" w:eastAsia="Times New Roman" w:hAnsi="Times New Roman"/>
+          <w:b w:val="false"/>
+          <w:bCs w:val="false"/>
+          <w:i/>
+          <w:iCs/>
+          <w:color w:val="000000"/>
+          <w:sz w:val="21"/>
+          <w:szCs w:val="21"/>
+        </w:rPr>
+        <w:t xml:space="preserve">Running Lab 6 against a real GA4 property</w:t>
+      </w:r>
+    </w:p>
+    <w:p>
+      <w:pPr>
+        <w:spacing w:after="160" w:before="0" w:line="276"/>
+      </w:pPr>
+      <w:r>
+        <w:rPr>
+          <w:rFonts w:ascii="Times New Roman" w:cs="Times New Roman" w:eastAsia="Times New Roman" w:hAnsi="Times New Roman"/>
+          <w:b w:val="false"/>
+          <w:bCs w:val="false"/>
+          <w:i w:val="false"/>
+          <w:iCs w:val="false"/>
+          <w:color w:val="000000"/>
+          <w:sz w:val="24"/>
+          <w:szCs w:val="24"/>
+        </w:rPr>
+        <w:t xml:space="preserve">The full click-by-click setup is written up in docs/GA4-SETUP.md in the repository.</w:t>
       </w:r>
     </w:p>
     <w:p>

</xml_diff>